<commit_message>
Rework handout recreations: radiation frame, dotted shadow headings, mixed colours
- Variant 2 page frame built from four header text boxes filled with radiation signs
- Variant 2 headings get the dotted stroke frame with a thick right/bottom shadow
- Drop the ХПК НУ «ЛП» / page-number footer from both variants
- Mixed student-style colour palette; Variant 1 band under the title as a table
- Guide rewritten to match

Co-Authored-By: Claude Opus 5.5 <noreply@anthropic.com>
Claude-Session: https://claude.ai/code/session_01NMobVqPmAxNmUbsnyQwyS9
</commit_message>
<xml_diff>
--- a/informatyka/Variant_1.docx
+++ b/informatyka/Variant_1.docx
@@ -1,12 +1,11 @@
 
 <file path=word/document.xml><?xml version="1.0" encoding="utf-8"?>
-<w:document xmlns:w="http://schemas.openxmlformats.org/wordprocessingml/2006/main" xmlns:r="http://schemas.openxmlformats.org/officeDocument/2006/relationships">
+<w:document xmlns:w="http://schemas.openxmlformats.org/wordprocessingml/2006/main" xmlns:r="http://schemas.openxmlformats.org/officeDocument/2006/relationships" xmlns:wp="http://schemas.openxmlformats.org/drawingml/2006/wordprocessingDrawing" xmlns:a="http://schemas.openxmlformats.org/drawingml/2006/main" xmlns:wps="http://schemas.microsoft.com/office/word/2010/wordprocessingShape">
   <w:body>
     <w:p>
       <w:pPr>
-        <w:shd w:val="clear" w:color="auto" w:fill="BDD7EE"/>
-        <w:spacing w:before="0" w:after="0"/>
-        <w:ind w:left="0" w:right="1418"/>
+        <w:spacing w:before="0" w:after="0"/>
+        <w:ind w:left="0" w:right="0"/>
         <w:jc w:val="center"/>
       </w:pPr>
       <w:r>
@@ -14,32 +13,84 @@
           <w:rFonts w:ascii="Arial" w:hAnsi="Arial" w:cs="Arial"/>
           <w:b/>
           <w:bCs/>
+          <w:color w:val="C00000"/>
           <w:sz w:val="32"/>
           <w:szCs w:val="32"/>
         </w:rPr>
         <w:t xml:space="preserve">Варіант 1</w:t>
       </w:r>
     </w:p>
-    <w:p>
-      <w:pPr>
-        <w:spacing w:before="0" w:after="120"/>
-        <w:ind w:left="0" w:right="0"/>
-        <w:jc w:val="right"/>
-      </w:pPr>
-      <w:r>
-        <w:rPr>
-          <w:rFonts w:ascii="Arial" w:hAnsi="Arial" w:cs="Arial"/>
-          <w:b/>
-          <w:bCs/>
-          <w:sz w:val="28"/>
-          <w:szCs w:val="28"/>
-        </w:rPr>
-        <w:t xml:space="preserve">Білет № 14</w:t>
-      </w:r>
-    </w:p>
-    <w:p>
-      <w:pPr>
-        <w:spacing w:before="0" w:after="120"/>
+    <w:tbl>
+      <w:tblPr>
+        <w:tblW w:w="9354" w:type="dxa"/>
+        <w:jc w:val="center"/>
+        <w:tblBorders>
+          <w:top w:val="nil"/>
+          <w:left w:val="nil"/>
+          <w:bottom w:val="nil"/>
+          <w:right w:val="nil"/>
+          <w:insideH w:val="nil"/>
+          <w:insideV w:val="nil"/>
+        </w:tblBorders>
+        <w:tblLayout w:type="fixed"/>
+        <w:tblCellMar>
+          <w:top w:w="0" w:type="dxa"/>
+          <w:left w:w="0" w:type="dxa"/>
+          <w:bottom w:w="0" w:type="dxa"/>
+          <w:right w:w="0" w:type="dxa"/>
+        </w:tblCellMar>
+        <w:tblLook w:val="0000"/>
+      </w:tblPr>
+      <w:tblGrid>
+        <w:gridCol w:w="6804"/>
+        <w:gridCol w:w="2550"/>
+      </w:tblGrid>
+      <w:tr>
+        <w:trPr>
+          <w:trHeight w:val="340" w:hRule="exact"/>
+        </w:trPr>
+        <w:tc>
+          <w:tcPr>
+            <w:tcW w:w="6804" w:type="dxa"/>
+            <w:shd w:val="clear" w:color="auto" w:fill="F8CBAD"/>
+            <w:vAlign w:val="center"/>
+          </w:tcPr>
+          <w:p>
+            <w:pPr>
+              <w:spacing w:before="0" w:after="0" w:line="20" w:lineRule="exact"/>
+              <w:ind w:left="0" w:right="0"/>
+            </w:pPr>
+          </w:p>
+        </w:tc>
+        <w:tc>
+          <w:tcPr>
+            <w:tcW w:w="2550" w:type="dxa"/>
+            <w:vAlign w:val="center"/>
+          </w:tcPr>
+          <w:p>
+            <w:pPr>
+              <w:spacing w:before="0" w:after="0"/>
+              <w:ind w:left="0" w:right="0"/>
+              <w:jc w:val="right"/>
+            </w:pPr>
+            <w:r>
+              <w:rPr>
+                <w:rFonts w:ascii="Arial" w:hAnsi="Arial" w:cs="Arial"/>
+                <w:b/>
+                <w:bCs/>
+                <w:color w:val="7030A0"/>
+                <w:sz w:val="28"/>
+                <w:szCs w:val="28"/>
+              </w:rPr>
+              <w:t xml:space="preserve">Білет № 14</w:t>
+            </w:r>
+          </w:p>
+        </w:tc>
+      </w:tr>
+    </w:tbl>
+    <w:p>
+      <w:pPr>
+        <w:spacing w:before="120" w:after="120"/>
         <w:ind w:left="567" w:right="567"/>
         <w:jc w:val="center"/>
       </w:pPr>
@@ -49,6 +100,7 @@
           <w:b/>
           <w:bCs/>
           <w:smallCaps/>
+          <w:color w:val="002060"/>
           <w:sz w:val="26"/>
           <w:szCs w:val="26"/>
         </w:rPr>
@@ -65,7 +117,7 @@
         <w:rPr>
           <w:rFonts w:ascii="Bookman Old Style" w:hAnsi="Bookman Old Style" w:cs="Bookman Old Style"/>
           <w:color w:val="FFFFFF"/>
-          <w:shd w:val="clear" w:color="auto" w:fill="1F4E79"/>
+          <w:shd w:val="clear" w:color="auto" w:fill="7030A0"/>
         </w:rPr>
         <w:t xml:space="preserve">Текстові редактори</w:t>
       </w:r>
@@ -86,7 +138,7 @@
         <w:rPr>
           <w:rFonts w:ascii="Bookman Old Style" w:hAnsi="Bookman Old Style" w:cs="Bookman Old Style"/>
           <w:color w:val="FFFFFF"/>
-          <w:shd w:val="clear" w:color="auto" w:fill="1F4E79"/>
+          <w:shd w:val="clear" w:color="auto" w:fill="548235"/>
         </w:rPr>
         <w:t xml:space="preserve">Текстові процесори</w:t>
       </w:r>
@@ -97,6 +149,7 @@
         <w:rPr>
           <w:i/>
           <w:iCs/>
+          <w:color w:val="0070C0"/>
           <w:u w:val="single"/>
         </w:rPr>
         <w:t xml:space="preserve">розширені</w:t>
@@ -109,12 +162,12 @@
       <w:pPr>
         <w:keepNext/>
         <w:pBdr>
-          <w:top w:val="single" w:sz="8" w:space="4" w:color="1F4E79" w:shadow="1"/>
-          <w:left w:val="single" w:sz="8" w:space="4" w:color="1F4E79" w:shadow="1"/>
-          <w:bottom w:val="single" w:sz="8" w:space="4" w:color="1F4E79" w:shadow="1"/>
-          <w:right w:val="single" w:sz="8" w:space="4" w:color="1F4E79" w:shadow="1"/>
-        </w:pBdr>
-        <w:shd w:val="clear" w:color="auto" w:fill="DEEAF6"/>
+          <w:top w:val="single" w:sz="12" w:space="4" w:color="C55A11" w:shadow="1"/>
+          <w:left w:val="single" w:sz="12" w:space="4" w:color="C55A11" w:shadow="1"/>
+          <w:bottom w:val="single" w:sz="12" w:space="4" w:color="C55A11" w:shadow="1"/>
+          <w:right w:val="single" w:sz="12" w:space="4" w:color="C55A11" w:shadow="1"/>
+        </w:pBdr>
+        <w:shd w:val="clear" w:color="auto" w:fill="FFF2CC"/>
         <w:spacing w:before="160" w:after="120"/>
         <w:ind w:left="0" w:right="0"/>
         <w:jc w:val="left"/>
@@ -124,6 +177,7 @@
           <w:rFonts w:ascii="Courier New" w:hAnsi="Courier New" w:cs="Courier New"/>
           <w:b/>
           <w:bCs/>
+          <w:color w:val="833C0B"/>
           <w:spacing w:val="60"/>
           <w:sz w:val="24"/>
           <w:szCs w:val="24"/>
@@ -134,7 +188,7 @@
     <w:p>
       <w:pPr>
         <w:pBdr>
-          <w:left w:val="single" w:sz="36" w:space="12" w:color="000000"/>
+          <w:left w:val="single" w:sz="36" w:space="12" w:color="7030A0"/>
         </w:pBdr>
         <w:spacing w:before="0" w:after="0"/>
         <w:ind w:left="2835" w:right="0" w:hanging="1134"/>
@@ -147,7 +201,7 @@
     <w:p>
       <w:pPr>
         <w:pBdr>
-          <w:left w:val="single" w:sz="36" w:space="12" w:color="000000"/>
+          <w:left w:val="single" w:sz="36" w:space="12" w:color="7030A0"/>
         </w:pBdr>
         <w:spacing w:before="0" w:after="0"/>
         <w:ind w:left="2835" w:right="0" w:hanging="1134"/>
@@ -160,7 +214,7 @@
     <w:p>
       <w:pPr>
         <w:pBdr>
-          <w:left w:val="single" w:sz="36" w:space="12" w:color="000000"/>
+          <w:left w:val="single" w:sz="36" w:space="12" w:color="7030A0"/>
         </w:pBdr>
         <w:spacing w:before="0" w:after="0"/>
         <w:ind w:left="2835" w:right="0" w:hanging="1134"/>
@@ -173,7 +227,7 @@
     <w:p>
       <w:pPr>
         <w:pBdr>
-          <w:left w:val="single" w:sz="36" w:space="12" w:color="000000"/>
+          <w:left w:val="single" w:sz="36" w:space="12" w:color="7030A0"/>
         </w:pBdr>
         <w:spacing w:before="0" w:after="0"/>
         <w:ind w:left="2835" w:right="0" w:hanging="1134"/>
@@ -186,7 +240,7 @@
     <w:p>
       <w:pPr>
         <w:pBdr>
-          <w:left w:val="single" w:sz="36" w:space="12" w:color="000000"/>
+          <w:left w:val="single" w:sz="36" w:space="12" w:color="7030A0"/>
         </w:pBdr>
         <w:spacing w:before="0" w:after="0"/>
         <w:ind w:left="2835" w:right="0" w:hanging="1134"/>
@@ -199,7 +253,7 @@
     <w:p>
       <w:pPr>
         <w:pBdr>
-          <w:left w:val="single" w:sz="36" w:space="12" w:color="000000"/>
+          <w:left w:val="single" w:sz="36" w:space="12" w:color="7030A0"/>
         </w:pBdr>
         <w:spacing w:before="0" w:after="0"/>
         <w:ind w:left="2835" w:right="0" w:hanging="1134"/>
@@ -225,7 +279,7 @@
       <w:r>
         <w:rPr>
           <w:rFonts w:ascii="Arial" w:hAnsi="Arial" w:cs="Arial"/>
-          <w:color w:val="1F4E79"/>
+          <w:color w:val="C00000"/>
           <w:position w:val="-8"/>
           <w:sz w:val="108"/>
           <w:szCs w:val="108"/>
@@ -254,6 +308,7 @@
           <w:bCs/>
           <w:i/>
           <w:iCs/>
+          <w:color w:val="0070C0"/>
           <w:sz w:val="26"/>
           <w:szCs w:val="26"/>
           <w:u w:val="single"/>
@@ -271,6 +326,7 @@
       <w:r>
         <w:rPr>
           <w:rFonts w:ascii="Arial" w:hAnsi="Arial" w:cs="Arial"/>
+          <w:color w:val="C55A11"/>
           <w:spacing w:val="100"/>
           <w:sz w:val="26"/>
           <w:szCs w:val="26"/>
@@ -281,7 +337,7 @@
     <w:p>
       <w:pPr>
         <w:pBdr>
-          <w:bottom w:val="dashed" w:sz="8" w:space="4" w:color="000000"/>
+          <w:bottom w:val="dashed" w:sz="8" w:space="4" w:color="7030A0"/>
         </w:pBdr>
         <w:spacing w:before="120" w:after="0"/>
         <w:ind w:left="0" w:right="0"/>
@@ -293,6 +349,7 @@
           <w:bCs/>
           <w:i/>
           <w:iCs/>
+          <w:color w:val="548235"/>
           <w:u w:val="single"/>
         </w:rPr>
         <w:t xml:space="preserve">Процедура форматування символів</w:t>
@@ -303,6 +360,7 @@
       <w:r>
         <w:rPr>
           <w:rFonts w:ascii="Arial Black" w:hAnsi="Arial Black" w:cs="Arial Black"/>
+          <w:color w:val="7030A0"/>
           <w:sz w:val="24"/>
           <w:szCs w:val="24"/>
         </w:rPr>
@@ -326,6 +384,7 @@
           <w:rFonts w:ascii="Bookman Old Style" w:hAnsi="Bookman Old Style" w:cs="Bookman Old Style"/>
           <w:b/>
           <w:bCs/>
+          <w:color w:val="0070C0"/>
           <w:spacing w:val="20"/>
         </w:rPr>
         <w:t xml:space="preserve">інтервалів</w:t>
@@ -335,7 +394,7 @@
       </w:r>
       <w:r>
         <w:rPr>
-          <w:bdr w:val="single" w:sz="6" w:space="0" w:color="000000"/>
+          <w:bdr w:val="single" w:sz="6" w:space="0" w:color="00B050"/>
         </w:rPr>
         <w:t xml:space="preserve">засобу</w:t>
       </w:r>
@@ -344,7 +403,7 @@
       </w:r>
       <w:r>
         <w:rPr>
-          <w:bdr w:val="dotted" w:sz="8" w:space="0" w:color="1F4E79"/>
+          <w:bdr w:val="dotted" w:sz="8" w:space="0" w:color="C00000"/>
         </w:rPr>
         <w:t xml:space="preserve">анімації</w:t>
       </w:r>
@@ -352,6 +411,9 @@
         <w:t xml:space="preserve"> (обрамлення, виділення) окремих слів та фрагментів тексту, введення в текст спеціальних символів</w:t>
       </w:r>
       <w:r>
+        <w:rPr>
+          <w:color w:val="C55A11"/>
+        </w:rPr>
         <w:sym w:font="Wingdings" w:char="F04A"/>
       </w:r>
       <w:r>
@@ -372,12 +434,12 @@
       <w:pPr>
         <w:keepNext/>
         <w:pBdr>
-          <w:top w:val="single" w:sz="8" w:space="4" w:color="1F4E79" w:shadow="1"/>
-          <w:left w:val="single" w:sz="8" w:space="4" w:color="1F4E79" w:shadow="1"/>
-          <w:bottom w:val="single" w:sz="8" w:space="4" w:color="1F4E79" w:shadow="1"/>
-          <w:right w:val="single" w:sz="8" w:space="4" w:color="1F4E79" w:shadow="1"/>
-        </w:pBdr>
-        <w:shd w:val="clear" w:color="auto" w:fill="DEEAF6"/>
+          <w:top w:val="single" w:sz="12" w:space="4" w:color="548235" w:shadow="1"/>
+          <w:left w:val="single" w:sz="12" w:space="4" w:color="548235" w:shadow="1"/>
+          <w:bottom w:val="single" w:sz="12" w:space="4" w:color="548235" w:shadow="1"/>
+          <w:right w:val="single" w:sz="12" w:space="4" w:color="548235" w:shadow="1"/>
+        </w:pBdr>
+        <w:shd w:val="clear" w:color="auto" w:fill="E2EFDA"/>
         <w:spacing w:before="160" w:after="120"/>
         <w:ind w:left="0" w:right="0"/>
         <w:jc w:val="left"/>
@@ -387,6 +449,7 @@
           <w:rFonts w:ascii="Courier New" w:hAnsi="Courier New" w:cs="Courier New"/>
           <w:b/>
           <w:bCs/>
+          <w:color w:val="548235"/>
           <w:spacing w:val="40"/>
           <w:sz w:val="24"/>
           <w:szCs w:val="24"/>
@@ -401,6 +464,7 @@
       </w:pPr>
       <w:r>
         <w:rPr>
+          <w:color w:val="C00000"/>
           <w:u w:val="single"/>
         </w:rPr>
         <w:t xml:space="preserve">Спосіб 1</w:t>
@@ -409,6 +473,9 @@
         <w:t xml:space="preserve"> - курсору миші</w:t>
       </w:r>
       <w:r>
+        <w:rPr>
+          <w:color w:val="C00000"/>
+        </w:rPr>
         <w:sym w:font="Wingdings" w:char="F038"/>
       </w:r>
     </w:p>
@@ -420,6 +487,7 @@
       </w:pPr>
       <w:r>
         <w:rPr>
+          <w:color w:val="0070C0"/>
           <w:u w:val="single"/>
         </w:rPr>
         <w:t xml:space="preserve">Спосіб 2</w:t>
@@ -428,6 +496,9 @@
         <w:t xml:space="preserve"> - лінійок прокрутки</w:t>
       </w:r>
       <w:r>
+        <w:rPr>
+          <w:color w:val="0070C0"/>
+        </w:rPr>
         <w:sym w:font="Wingdings" w:char="F049"/>
       </w:r>
     </w:p>
@@ -439,6 +510,7 @@
       </w:pPr>
       <w:r>
         <w:rPr>
+          <w:color w:val="548235"/>
           <w:u w:val="single"/>
         </w:rPr>
         <w:t xml:space="preserve">Спосіб 3</w:t>
@@ -447,6 +519,9 @@
         <w:t xml:space="preserve"> - клавіш</w:t>
       </w:r>
       <w:r>
+        <w:rPr>
+          <w:color w:val="548235"/>
+        </w:rPr>
         <w:sym w:font="Wingdings" w:char="F037"/>
       </w:r>
     </w:p>
@@ -454,12 +529,12 @@
       <w:pPr>
         <w:keepNext/>
         <w:pBdr>
-          <w:top w:val="single" w:sz="8" w:space="4" w:color="1F4E79" w:shadow="1"/>
-          <w:left w:val="single" w:sz="8" w:space="4" w:color="1F4E79" w:shadow="1"/>
-          <w:bottom w:val="single" w:sz="8" w:space="4" w:color="1F4E79" w:shadow="1"/>
-          <w:right w:val="single" w:sz="8" w:space="4" w:color="1F4E79" w:shadow="1"/>
-        </w:pBdr>
-        <w:shd w:val="clear" w:color="auto" w:fill="DEEAF6"/>
+          <w:top w:val="single" w:sz="12" w:space="4" w:color="0070C0" w:shadow="1"/>
+          <w:left w:val="single" w:sz="12" w:space="4" w:color="0070C0" w:shadow="1"/>
+          <w:bottom w:val="single" w:sz="12" w:space="4" w:color="0070C0" w:shadow="1"/>
+          <w:right w:val="single" w:sz="12" w:space="4" w:color="0070C0" w:shadow="1"/>
+        </w:pBdr>
+        <w:shd w:val="clear" w:color="auto" w:fill="DEEBF7"/>
         <w:spacing w:before="160" w:after="120"/>
         <w:ind w:left="0" w:right="0"/>
         <w:jc w:val="center"/>
@@ -469,6 +544,7 @@
           <w:rFonts w:ascii="Courier New" w:hAnsi="Courier New" w:cs="Courier New"/>
           <w:b/>
           <w:bCs/>
+          <w:color w:val="002060"/>
           <w:spacing w:val="120"/>
           <w:sz w:val="24"/>
           <w:szCs w:val="24"/>
@@ -484,6 +560,7 @@
       <w:r>
         <w:rPr>
           <w:rFonts w:ascii="Monotype Corsiva" w:hAnsi="Monotype Corsiva" w:cs="Monotype Corsiva"/>
+          <w:color w:val="7030A0"/>
           <w:sz w:val="26"/>
           <w:szCs w:val="26"/>
           <w:u w:val="single"/>
@@ -500,6 +577,7 @@
       </w:r>
       <w:r>
         <w:rPr>
+          <w:color w:val="0070C0"/>
           <w:sz w:val="26"/>
           <w:szCs w:val="26"/>
         </w:rPr>
@@ -532,6 +610,7 @@
       </w:r>
       <w:r>
         <w:rPr>
+          <w:color w:val="C00000"/>
           <w:sz w:val="26"/>
           <w:szCs w:val="26"/>
         </w:rPr>
@@ -554,6 +633,7 @@
       <w:r>
         <w:rPr>
           <w:rFonts w:ascii="Monotype Corsiva" w:hAnsi="Monotype Corsiva" w:cs="Monotype Corsiva"/>
+          <w:color w:val="7030A0"/>
           <w:sz w:val="26"/>
           <w:szCs w:val="26"/>
           <w:u w:val="single"/>
@@ -570,6 +650,7 @@
       </w:r>
       <w:r>
         <w:rPr>
+          <w:color w:val="0070C0"/>
           <w:sz w:val="26"/>
           <w:szCs w:val="26"/>
         </w:rPr>
@@ -602,6 +683,7 @@
       </w:r>
       <w:r>
         <w:rPr>
+          <w:color w:val="C00000"/>
           <w:sz w:val="26"/>
           <w:szCs w:val="26"/>
         </w:rPr>
@@ -624,6 +706,7 @@
       <w:r>
         <w:rPr>
           <w:rFonts w:ascii="Monotype Corsiva" w:hAnsi="Monotype Corsiva" w:cs="Monotype Corsiva"/>
+          <w:color w:val="7030A0"/>
           <w:sz w:val="26"/>
           <w:szCs w:val="26"/>
           <w:u w:val="single"/>
@@ -640,6 +723,7 @@
       </w:r>
       <w:r>
         <w:rPr>
+          <w:color w:val="0070C0"/>
           <w:sz w:val="26"/>
           <w:szCs w:val="26"/>
         </w:rPr>
@@ -672,6 +756,7 @@
       </w:r>
       <w:r>
         <w:rPr>
+          <w:color w:val="C00000"/>
           <w:sz w:val="26"/>
           <w:szCs w:val="26"/>
         </w:rPr>
@@ -689,12 +774,12 @@
     <w:p>
       <w:pPr>
         <w:pBdr>
-          <w:top w:val="single" w:sz="8" w:space="4" w:color="1F4E79" w:shadow="1"/>
-          <w:left w:val="single" w:sz="8" w:space="4" w:color="1F4E79" w:shadow="1"/>
-          <w:bottom w:val="single" w:sz="8" w:space="4" w:color="1F4E79" w:shadow="1"/>
-          <w:right w:val="single" w:sz="8" w:space="4" w:color="1F4E79" w:shadow="1"/>
-        </w:pBdr>
-        <w:shd w:val="clear" w:color="auto" w:fill="DEEAF6"/>
+          <w:top w:val="single" w:sz="12" w:space="4" w:color="C00000" w:shadow="1"/>
+          <w:left w:val="single" w:sz="12" w:space="4" w:color="C00000" w:shadow="1"/>
+          <w:bottom w:val="single" w:sz="12" w:space="4" w:color="C00000" w:shadow="1"/>
+          <w:right w:val="single" w:sz="12" w:space="4" w:color="C00000" w:shadow="1"/>
+        </w:pBdr>
+        <w:shd w:val="clear" w:color="auto" w:fill="FBE5D6"/>
         <w:spacing w:before="200" w:after="0"/>
         <w:ind w:left="0" w:right="0"/>
         <w:jc w:val="center"/>
@@ -704,9 +789,8 @@
           <w:rFonts w:ascii="Arial" w:hAnsi="Arial" w:cs="Arial"/>
           <w:b/>
           <w:bCs/>
-          <w:i/>
-          <w:iCs/>
-          <w:spacing w:val="-10"/>
+          <w:color w:val="C00000"/>
+          <w:spacing w:val="-6"/>
           <w:sz w:val="24"/>
           <w:szCs w:val="24"/>
         </w:rPr>
@@ -714,14 +798,13 @@
       </w:r>
     </w:p>
     <w:sectPr>
-      <w:footerReference w:type="default" r:id="rIdFooter"/>
       <w:pgSz w:w="11906" w:h="16838"/>
       <w:pgMar w:top="850" w:right="1134" w:bottom="850" w:left="1418" w:header="567" w:footer="397" w:gutter="0"/>
       <w:pgBorders w:offsetFrom="page">
-        <w:top w:val="musicNotes" w:sz="20" w:space="24" w:color="1F4E79"/>
-        <w:left w:val="musicNotes" w:sz="20" w:space="24" w:color="1F4E79"/>
-        <w:bottom w:val="musicNotes" w:sz="20" w:space="24" w:color="1F4E79"/>
-        <w:right w:val="musicNotes" w:sz="20" w:space="24" w:color="1F4E79"/>
+        <w:top w:val="musicNotes" w:sz="18" w:space="20" w:color="7030A0"/>
+        <w:left w:val="musicNotes" w:sz="18" w:space="20" w:color="7030A0"/>
+        <w:bottom w:val="musicNotes" w:sz="18" w:space="20" w:color="7030A0"/>
+        <w:right w:val="musicNotes" w:sz="18" w:space="20" w:color="7030A0"/>
       </w:pgBorders>
       <w:cols w:space="708"/>
     </w:sectPr>
@@ -729,45 +812,8 @@
 </w:document>
 </file>
 
-<file path=word/footer1.xml><?xml version="1.0" encoding="utf-8"?>
-<w:ftr xmlns:w="http://schemas.openxmlformats.org/wordprocessingml/2006/main" xmlns:r="http://schemas.openxmlformats.org/officeDocument/2006/relationships">
-  <w:p>
-    <w:pPr>
-      <w:tabs>
-        <w:tab w:val="center" w:pos="4678"/>
-        <w:tab w:val="right" w:pos="9356"/>
-      </w:tabs>
-      <w:spacing w:before="0" w:after="0"/>
-      <w:ind w:left="0" w:right="0"/>
-    </w:pPr>
-    <w:r>
-      <w:tab/>
-    </w:r>
-    <w:r>
-      <w:rPr>
-        <w:b/>
-        <w:bCs/>
-        <w:sz w:val="24"/>
-        <w:szCs w:val="24"/>
-      </w:rPr>
-      <w:t xml:space="preserve">ХПК НУ «ЛП»</w:t>
-    </w:r>
-    <w:r>
-      <w:tab/>
-    </w:r>
-    <w:r>
-      <w:rPr>
-        <w:sz w:val="24"/>
-        <w:szCs w:val="24"/>
-      </w:rPr>
-      <w:t xml:space="preserve">- 13 -</w:t>
-    </w:r>
-  </w:p>
-</w:ftr>
-</file>
-
 <file path=word/styles.xml><?xml version="1.0" encoding="utf-8"?>
-<w:styles xmlns:w="http://schemas.openxmlformats.org/wordprocessingml/2006/main" xmlns:r="http://schemas.openxmlformats.org/officeDocument/2006/relationships">
+<w:styles xmlns:w="http://schemas.openxmlformats.org/wordprocessingml/2006/main" xmlns:r="http://schemas.openxmlformats.org/officeDocument/2006/relationships" xmlns:wp="http://schemas.openxmlformats.org/drawingml/2006/wordprocessingDrawing" xmlns:a="http://schemas.openxmlformats.org/drawingml/2006/main" xmlns:wps="http://schemas.microsoft.com/office/word/2010/wordprocessingShape">
   <w:docDefaults>
     <w:rPrDefault>
       <w:rPr>
@@ -787,8 +833,8 @@
     <w:name w:val="Normal"/>
     <w:qFormat/>
   </w:style>
-  <w:style w:type="paragraph" w:styleId="Footer">
-    <w:name w:val="footer"/>
+  <w:style w:type="paragraph" w:styleId="Header">
+    <w:name w:val="header"/>
     <w:basedOn w:val="Normal"/>
   </w:style>
   <w:style w:type="table" w:default="1" w:styleId="TableNormal">

</xml_diff>

<commit_message>
Handout recreations: Word-only frames and symbols, text back to original styling
- Both page frames are built-in Word art borders (music notes / circle sectors)
- Icons and suits are Wingdings/Symbol characters again
- Text is black as on the sheet; only fills, frames and lines are coloured
- Variant 1: title band holds the text, no underline on the procedure heading,
  'інтервалів' stretched to 150 %, italic spaced 'шрифту, абзацу, сторінки'
- Guide rewritten to match

Co-Authored-By: Claude Opus 5.5 <noreply@anthropic.com>
Claude-Session: https://claude.ai/code/session_01NMobVqPmAxNmUbsnyQwyS9
</commit_message>
<xml_diff>
--- a/informatyka/Variant_1.docx
+++ b/informatyka/Variant_1.docx
@@ -1,11 +1,12 @@
 
 <file path=word/document.xml><?xml version="1.0" encoding="utf-8"?>
-<w:document xmlns:w="http://schemas.openxmlformats.org/wordprocessingml/2006/main" xmlns:r="http://schemas.openxmlformats.org/officeDocument/2006/relationships" xmlns:wp="http://schemas.openxmlformats.org/drawingml/2006/wordprocessingDrawing" xmlns:a="http://schemas.openxmlformats.org/drawingml/2006/main" xmlns:wps="http://schemas.microsoft.com/office/word/2010/wordprocessingShape">
+<w:document xmlns:w="http://schemas.openxmlformats.org/wordprocessingml/2006/main" xmlns:r="http://schemas.openxmlformats.org/officeDocument/2006/relationships">
   <w:body>
     <w:p>
       <w:pPr>
-        <w:spacing w:before="0" w:after="0"/>
-        <w:ind w:left="0" w:right="0"/>
+        <w:shd w:val="clear" w:color="auto" w:fill="F8CBAD"/>
+        <w:spacing w:before="0" w:after="0"/>
+        <w:ind w:left="0" w:right="1701"/>
         <w:jc w:val="center"/>
       </w:pPr>
       <w:r>
@@ -13,84 +14,32 @@
           <w:rFonts w:ascii="Arial" w:hAnsi="Arial" w:cs="Arial"/>
           <w:b/>
           <w:bCs/>
-          <w:color w:val="C00000"/>
           <w:sz w:val="32"/>
           <w:szCs w:val="32"/>
         </w:rPr>
         <w:t xml:space="preserve">Варіант 1</w:t>
       </w:r>
     </w:p>
-    <w:tbl>
-      <w:tblPr>
-        <w:tblW w:w="9354" w:type="dxa"/>
-        <w:jc w:val="center"/>
-        <w:tblBorders>
-          <w:top w:val="nil"/>
-          <w:left w:val="nil"/>
-          <w:bottom w:val="nil"/>
-          <w:right w:val="nil"/>
-          <w:insideH w:val="nil"/>
-          <w:insideV w:val="nil"/>
-        </w:tblBorders>
-        <w:tblLayout w:type="fixed"/>
-        <w:tblCellMar>
-          <w:top w:w="0" w:type="dxa"/>
-          <w:left w:w="0" w:type="dxa"/>
-          <w:bottom w:w="0" w:type="dxa"/>
-          <w:right w:w="0" w:type="dxa"/>
-        </w:tblCellMar>
-        <w:tblLook w:val="0000"/>
-      </w:tblPr>
-      <w:tblGrid>
-        <w:gridCol w:w="6804"/>
-        <w:gridCol w:w="2550"/>
-      </w:tblGrid>
-      <w:tr>
-        <w:trPr>
-          <w:trHeight w:val="340" w:hRule="exact"/>
-        </w:trPr>
-        <w:tc>
-          <w:tcPr>
-            <w:tcW w:w="6804" w:type="dxa"/>
-            <w:shd w:val="clear" w:color="auto" w:fill="F8CBAD"/>
-            <w:vAlign w:val="center"/>
-          </w:tcPr>
-          <w:p>
-            <w:pPr>
-              <w:spacing w:before="0" w:after="0" w:line="20" w:lineRule="exact"/>
-              <w:ind w:left="0" w:right="0"/>
-            </w:pPr>
-          </w:p>
-        </w:tc>
-        <w:tc>
-          <w:tcPr>
-            <w:tcW w:w="2550" w:type="dxa"/>
-            <w:vAlign w:val="center"/>
-          </w:tcPr>
-          <w:p>
-            <w:pPr>
-              <w:spacing w:before="0" w:after="0"/>
-              <w:ind w:left="0" w:right="0"/>
-              <w:jc w:val="right"/>
-            </w:pPr>
-            <w:r>
-              <w:rPr>
-                <w:rFonts w:ascii="Arial" w:hAnsi="Arial" w:cs="Arial"/>
-                <w:b/>
-                <w:bCs/>
-                <w:color w:val="7030A0"/>
-                <w:sz w:val="28"/>
-                <w:szCs w:val="28"/>
-              </w:rPr>
-              <w:t xml:space="preserve">Білет № 14</w:t>
-            </w:r>
-          </w:p>
-        </w:tc>
-      </w:tr>
-    </w:tbl>
-    <w:p>
-      <w:pPr>
-        <w:spacing w:before="120" w:after="120"/>
+    <w:p>
+      <w:pPr>
+        <w:spacing w:before="0" w:after="80"/>
+        <w:ind w:left="0" w:right="0"/>
+        <w:jc w:val="right"/>
+      </w:pPr>
+      <w:r>
+        <w:rPr>
+          <w:rFonts w:ascii="Arial" w:hAnsi="Arial" w:cs="Arial"/>
+          <w:b/>
+          <w:bCs/>
+          <w:sz w:val="28"/>
+          <w:szCs w:val="28"/>
+        </w:rPr>
+        <w:t xml:space="preserve">Білет № 14</w:t>
+      </w:r>
+    </w:p>
+    <w:p>
+      <w:pPr>
+        <w:spacing w:before="0" w:after="120"/>
         <w:ind w:left="567" w:right="567"/>
         <w:jc w:val="center"/>
       </w:pPr>
@@ -100,7 +49,6 @@
           <w:b/>
           <w:bCs/>
           <w:smallCaps/>
-          <w:color w:val="002060"/>
           <w:sz w:val="26"/>
           <w:szCs w:val="26"/>
         </w:rPr>
@@ -149,7 +97,6 @@
         <w:rPr>
           <w:i/>
           <w:iCs/>
-          <w:color w:val="0070C0"/>
           <w:u w:val="single"/>
         </w:rPr>
         <w:t xml:space="preserve">розширені</w:t>
@@ -177,7 +124,6 @@
           <w:rFonts w:ascii="Courier New" w:hAnsi="Courier New" w:cs="Courier New"/>
           <w:b/>
           <w:bCs/>
-          <w:color w:val="833C0B"/>
           <w:spacing w:val="60"/>
           <w:sz w:val="24"/>
           <w:szCs w:val="24"/>
@@ -279,7 +225,7 @@
       <w:r>
         <w:rPr>
           <w:rFonts w:ascii="Arial" w:hAnsi="Arial" w:cs="Arial"/>
-          <w:color w:val="C00000"/>
+          <w:color w:val="000000"/>
           <w:position w:val="-8"/>
           <w:sz w:val="108"/>
           <w:szCs w:val="108"/>
@@ -308,10 +254,9 @@
           <w:bCs/>
           <w:i/>
           <w:iCs/>
-          <w:color w:val="0070C0"/>
           <w:sz w:val="26"/>
           <w:szCs w:val="26"/>
-          <w:u w:val="single"/>
+          <w:u w:val="dotted"/>
         </w:rPr>
         <w:t xml:space="preserve">форматування</w:t>
       </w:r>
@@ -326,7 +271,8 @@
       <w:r>
         <w:rPr>
           <w:rFonts w:ascii="Arial" w:hAnsi="Arial" w:cs="Arial"/>
-          <w:color w:val="C55A11"/>
+          <w:i/>
+          <w:iCs/>
           <w:spacing w:val="100"/>
           <w:sz w:val="26"/>
           <w:szCs w:val="26"/>
@@ -349,8 +295,6 @@
           <w:bCs/>
           <w:i/>
           <w:iCs/>
-          <w:color w:val="548235"/>
-          <w:u w:val="single"/>
         </w:rPr>
         <w:t xml:space="preserve">Процедура форматування символів</w:t>
       </w:r>
@@ -360,7 +304,6 @@
       <w:r>
         <w:rPr>
           <w:rFonts w:ascii="Arial Black" w:hAnsi="Arial Black" w:cs="Arial Black"/>
-          <w:color w:val="7030A0"/>
           <w:sz w:val="24"/>
           <w:szCs w:val="24"/>
         </w:rPr>
@@ -384,8 +327,8 @@
           <w:rFonts w:ascii="Bookman Old Style" w:hAnsi="Bookman Old Style" w:cs="Bookman Old Style"/>
           <w:b/>
           <w:bCs/>
-          <w:color w:val="0070C0"/>
           <w:spacing w:val="20"/>
+          <w:w w:val="150"/>
         </w:rPr>
         <w:t xml:space="preserve">інтервалів</w:t>
       </w:r>
@@ -394,7 +337,7 @@
       </w:r>
       <w:r>
         <w:rPr>
-          <w:bdr w:val="single" w:sz="6" w:space="0" w:color="00B050"/>
+          <w:bdr w:val="single" w:sz="6" w:space="0" w:color="000000"/>
         </w:rPr>
         <w:t xml:space="preserve">засобу</w:t>
       </w:r>
@@ -403,7 +346,7 @@
       </w:r>
       <w:r>
         <w:rPr>
-          <w:bdr w:val="dotted" w:sz="8" w:space="0" w:color="C00000"/>
+          <w:bdr w:val="dotted" w:sz="8" w:space="0" w:color="000000"/>
         </w:rPr>
         <w:t xml:space="preserve">анімації</w:t>
       </w:r>
@@ -411,9 +354,6 @@
         <w:t xml:space="preserve"> (обрамлення, виділення) окремих слів та фрагментів тексту, введення в текст спеціальних символів</w:t>
       </w:r>
       <w:r>
-        <w:rPr>
-          <w:color w:val="C55A11"/>
-        </w:rPr>
         <w:sym w:font="Wingdings" w:char="F04A"/>
       </w:r>
       <w:r>
@@ -449,7 +389,6 @@
           <w:rFonts w:ascii="Courier New" w:hAnsi="Courier New" w:cs="Courier New"/>
           <w:b/>
           <w:bCs/>
-          <w:color w:val="548235"/>
           <w:spacing w:val="40"/>
           <w:sz w:val="24"/>
           <w:szCs w:val="24"/>
@@ -464,7 +403,6 @@
       </w:pPr>
       <w:r>
         <w:rPr>
-          <w:color w:val="C00000"/>
           <w:u w:val="single"/>
         </w:rPr>
         <w:t xml:space="preserve">Спосіб 1</w:t>
@@ -473,9 +411,6 @@
         <w:t xml:space="preserve"> - курсору миші</w:t>
       </w:r>
       <w:r>
-        <w:rPr>
-          <w:color w:val="C00000"/>
-        </w:rPr>
         <w:sym w:font="Wingdings" w:char="F038"/>
       </w:r>
     </w:p>
@@ -487,7 +422,6 @@
       </w:pPr>
       <w:r>
         <w:rPr>
-          <w:color w:val="0070C0"/>
           <w:u w:val="single"/>
         </w:rPr>
         <w:t xml:space="preserve">Спосіб 2</w:t>
@@ -496,9 +430,6 @@
         <w:t xml:space="preserve"> - лінійок прокрутки</w:t>
       </w:r>
       <w:r>
-        <w:rPr>
-          <w:color w:val="0070C0"/>
-        </w:rPr>
         <w:sym w:font="Wingdings" w:char="F049"/>
       </w:r>
     </w:p>
@@ -510,7 +441,6 @@
       </w:pPr>
       <w:r>
         <w:rPr>
-          <w:color w:val="548235"/>
           <w:u w:val="single"/>
         </w:rPr>
         <w:t xml:space="preserve">Спосіб 3</w:t>
@@ -519,9 +449,6 @@
         <w:t xml:space="preserve"> - клавіш</w:t>
       </w:r>
       <w:r>
-        <w:rPr>
-          <w:color w:val="548235"/>
-        </w:rPr>
         <w:sym w:font="Wingdings" w:char="F037"/>
       </w:r>
     </w:p>
@@ -544,7 +471,6 @@
           <w:rFonts w:ascii="Courier New" w:hAnsi="Courier New" w:cs="Courier New"/>
           <w:b/>
           <w:bCs/>
-          <w:color w:val="002060"/>
           <w:spacing w:val="120"/>
           <w:sz w:val="24"/>
           <w:szCs w:val="24"/>
@@ -560,9 +486,8 @@
       <w:r>
         <w:rPr>
           <w:rFonts w:ascii="Monotype Corsiva" w:hAnsi="Monotype Corsiva" w:cs="Monotype Corsiva"/>
-          <w:color w:val="7030A0"/>
-          <w:sz w:val="26"/>
-          <w:szCs w:val="26"/>
+          <w:sz w:val="24"/>
+          <w:szCs w:val="24"/>
           <w:u w:val="single"/>
         </w:rPr>
         <w:t xml:space="preserve">Створення нового документа:</w:t>
@@ -570,24 +495,23 @@
       <w:r>
         <w:rPr>
           <w:rFonts w:ascii="Monotype Corsiva" w:hAnsi="Monotype Corsiva" w:cs="Monotype Corsiva"/>
-          <w:sz w:val="26"/>
-          <w:szCs w:val="26"/>
+          <w:sz w:val="24"/>
+          <w:szCs w:val="24"/>
         </w:rPr>
         <w:t xml:space="preserve"> кнопка </w:t>
       </w:r>
       <w:r>
         <w:rPr>
-          <w:color w:val="0070C0"/>
-          <w:sz w:val="26"/>
-          <w:szCs w:val="26"/>
+          <w:sz w:val="24"/>
+          <w:szCs w:val="24"/>
         </w:rPr>
         <w:sym w:font="Wingdings" w:char="F032"/>
       </w:r>
       <w:r>
         <w:rPr>
           <w:rFonts w:ascii="Monotype Corsiva" w:hAnsi="Monotype Corsiva" w:cs="Monotype Corsiva"/>
-          <w:sz w:val="26"/>
-          <w:szCs w:val="26"/>
+          <w:sz w:val="24"/>
+          <w:szCs w:val="24"/>
         </w:rPr>
         <w:t xml:space="preserve"> </w:t>
       </w:r>
@@ -595,32 +519,31 @@
         <w:rPr>
           <w:rFonts w:ascii="Monotype Corsiva" w:hAnsi="Monotype Corsiva" w:cs="Monotype Corsiva"/>
           <w:position w:val="-6"/>
-          <w:sz w:val="26"/>
-          <w:szCs w:val="26"/>
+          <w:sz w:val="24"/>
+          <w:szCs w:val="24"/>
         </w:rPr>
         <w:t xml:space="preserve">на</w:t>
       </w:r>
       <w:r>
         <w:rPr>
           <w:rFonts w:ascii="Monotype Corsiva" w:hAnsi="Monotype Corsiva" w:cs="Monotype Corsiva"/>
-          <w:sz w:val="26"/>
-          <w:szCs w:val="26"/>
+          <w:sz w:val="24"/>
+          <w:szCs w:val="24"/>
         </w:rPr>
         <w:t xml:space="preserve"> панелі швидкого доступу або Файл </w:t>
       </w:r>
       <w:r>
         <w:rPr>
-          <w:color w:val="C00000"/>
-          <w:sz w:val="26"/>
-          <w:szCs w:val="26"/>
+          <w:sz w:val="24"/>
+          <w:szCs w:val="24"/>
         </w:rPr>
         <w:sym w:font="Symbol" w:char="F0DE"/>
       </w:r>
       <w:r>
         <w:rPr>
           <w:rFonts w:ascii="Monotype Corsiva" w:hAnsi="Monotype Corsiva" w:cs="Monotype Corsiva"/>
-          <w:sz w:val="26"/>
-          <w:szCs w:val="26"/>
+          <w:sz w:val="24"/>
+          <w:szCs w:val="24"/>
         </w:rPr>
         <w:t xml:space="preserve"> Створити</w:t>
       </w:r>
@@ -633,9 +556,8 @@
       <w:r>
         <w:rPr>
           <w:rFonts w:ascii="Monotype Corsiva" w:hAnsi="Monotype Corsiva" w:cs="Monotype Corsiva"/>
-          <w:color w:val="7030A0"/>
-          <w:sz w:val="26"/>
-          <w:szCs w:val="26"/>
+          <w:sz w:val="24"/>
+          <w:szCs w:val="24"/>
           <w:u w:val="single"/>
         </w:rPr>
         <w:t xml:space="preserve">Відкриття документа:</w:t>
@@ -643,24 +565,23 @@
       <w:r>
         <w:rPr>
           <w:rFonts w:ascii="Monotype Corsiva" w:hAnsi="Monotype Corsiva" w:cs="Monotype Corsiva"/>
-          <w:sz w:val="26"/>
-          <w:szCs w:val="26"/>
+          <w:sz w:val="24"/>
+          <w:szCs w:val="24"/>
         </w:rPr>
         <w:t xml:space="preserve"> кнопка </w:t>
       </w:r>
       <w:r>
         <w:rPr>
-          <w:color w:val="0070C0"/>
-          <w:sz w:val="26"/>
-          <w:szCs w:val="26"/>
+          <w:sz w:val="24"/>
+          <w:szCs w:val="24"/>
         </w:rPr>
         <w:sym w:font="Wingdings" w:char="F031"/>
       </w:r>
       <w:r>
         <w:rPr>
           <w:rFonts w:ascii="Monotype Corsiva" w:hAnsi="Monotype Corsiva" w:cs="Monotype Corsiva"/>
-          <w:sz w:val="26"/>
-          <w:szCs w:val="26"/>
+          <w:sz w:val="24"/>
+          <w:szCs w:val="24"/>
         </w:rPr>
         <w:t xml:space="preserve"> </w:t>
       </w:r>
@@ -668,32 +589,31 @@
         <w:rPr>
           <w:rFonts w:ascii="Monotype Corsiva" w:hAnsi="Monotype Corsiva" w:cs="Monotype Corsiva"/>
           <w:position w:val="-6"/>
-          <w:sz w:val="26"/>
-          <w:szCs w:val="26"/>
+          <w:sz w:val="24"/>
+          <w:szCs w:val="24"/>
         </w:rPr>
         <w:t xml:space="preserve">на</w:t>
       </w:r>
       <w:r>
         <w:rPr>
           <w:rFonts w:ascii="Monotype Corsiva" w:hAnsi="Monotype Corsiva" w:cs="Monotype Corsiva"/>
-          <w:sz w:val="26"/>
-          <w:szCs w:val="26"/>
+          <w:sz w:val="24"/>
+          <w:szCs w:val="24"/>
         </w:rPr>
         <w:t xml:space="preserve"> панелі швидкого доступу або Файл </w:t>
       </w:r>
       <w:r>
         <w:rPr>
-          <w:color w:val="C00000"/>
-          <w:sz w:val="26"/>
-          <w:szCs w:val="26"/>
+          <w:sz w:val="24"/>
+          <w:szCs w:val="24"/>
         </w:rPr>
         <w:sym w:font="Symbol" w:char="F0DE"/>
       </w:r>
       <w:r>
         <w:rPr>
           <w:rFonts w:ascii="Monotype Corsiva" w:hAnsi="Monotype Corsiva" w:cs="Monotype Corsiva"/>
-          <w:sz w:val="26"/>
-          <w:szCs w:val="26"/>
+          <w:sz w:val="24"/>
+          <w:szCs w:val="24"/>
         </w:rPr>
         <w:t xml:space="preserve"> Відкрити.</w:t>
       </w:r>
@@ -706,9 +626,8 @@
       <w:r>
         <w:rPr>
           <w:rFonts w:ascii="Monotype Corsiva" w:hAnsi="Monotype Corsiva" w:cs="Monotype Corsiva"/>
-          <w:color w:val="7030A0"/>
-          <w:sz w:val="26"/>
-          <w:szCs w:val="26"/>
+          <w:sz w:val="24"/>
+          <w:szCs w:val="24"/>
           <w:u w:val="single"/>
         </w:rPr>
         <w:t xml:space="preserve">Збереження документа:</w:t>
@@ -716,24 +635,23 @@
       <w:r>
         <w:rPr>
           <w:rFonts w:ascii="Monotype Corsiva" w:hAnsi="Monotype Corsiva" w:cs="Monotype Corsiva"/>
-          <w:sz w:val="26"/>
-          <w:szCs w:val="26"/>
+          <w:sz w:val="24"/>
+          <w:szCs w:val="24"/>
         </w:rPr>
         <w:t xml:space="preserve"> кнопка </w:t>
       </w:r>
       <w:r>
         <w:rPr>
-          <w:color w:val="0070C0"/>
-          <w:sz w:val="26"/>
-          <w:szCs w:val="26"/>
+          <w:sz w:val="24"/>
+          <w:szCs w:val="24"/>
         </w:rPr>
         <w:sym w:font="Wingdings" w:char="F03C"/>
       </w:r>
       <w:r>
         <w:rPr>
           <w:rFonts w:ascii="Monotype Corsiva" w:hAnsi="Monotype Corsiva" w:cs="Monotype Corsiva"/>
-          <w:sz w:val="26"/>
-          <w:szCs w:val="26"/>
+          <w:sz w:val="24"/>
+          <w:szCs w:val="24"/>
         </w:rPr>
         <w:t xml:space="preserve"> </w:t>
       </w:r>
@@ -741,32 +659,31 @@
         <w:rPr>
           <w:rFonts w:ascii="Monotype Corsiva" w:hAnsi="Monotype Corsiva" w:cs="Monotype Corsiva"/>
           <w:position w:val="-6"/>
-          <w:sz w:val="26"/>
-          <w:szCs w:val="26"/>
+          <w:sz w:val="24"/>
+          <w:szCs w:val="24"/>
         </w:rPr>
         <w:t xml:space="preserve">на</w:t>
       </w:r>
       <w:r>
         <w:rPr>
           <w:rFonts w:ascii="Monotype Corsiva" w:hAnsi="Monotype Corsiva" w:cs="Monotype Corsiva"/>
-          <w:sz w:val="26"/>
-          <w:szCs w:val="26"/>
+          <w:sz w:val="24"/>
+          <w:szCs w:val="24"/>
         </w:rPr>
         <w:t xml:space="preserve"> панелі швидкого доступу або Файл </w:t>
       </w:r>
       <w:r>
         <w:rPr>
-          <w:color w:val="C00000"/>
-          <w:sz w:val="26"/>
-          <w:szCs w:val="26"/>
+          <w:sz w:val="24"/>
+          <w:szCs w:val="24"/>
         </w:rPr>
         <w:sym w:font="Symbol" w:char="F0DE"/>
       </w:r>
       <w:r>
         <w:rPr>
           <w:rFonts w:ascii="Monotype Corsiva" w:hAnsi="Monotype Corsiva" w:cs="Monotype Corsiva"/>
-          <w:sz w:val="26"/>
-          <w:szCs w:val="26"/>
+          <w:sz w:val="24"/>
+          <w:szCs w:val="24"/>
         </w:rPr>
         <w:t xml:space="preserve"> Зберегти (Зберегти як...)</w:t>
       </w:r>
@@ -789,7 +706,6 @@
           <w:rFonts w:ascii="Arial" w:hAnsi="Arial" w:cs="Arial"/>
           <w:b/>
           <w:bCs/>
-          <w:color w:val="C00000"/>
           <w:spacing w:val="-6"/>
           <w:sz w:val="24"/>
           <w:szCs w:val="24"/>
@@ -813,7 +729,7 @@
 </file>
 
 <file path=word/styles.xml><?xml version="1.0" encoding="utf-8"?>
-<w:styles xmlns:w="http://schemas.openxmlformats.org/wordprocessingml/2006/main" xmlns:r="http://schemas.openxmlformats.org/officeDocument/2006/relationships" xmlns:wp="http://schemas.openxmlformats.org/drawingml/2006/wordprocessingDrawing" xmlns:a="http://schemas.openxmlformats.org/drawingml/2006/main" xmlns:wps="http://schemas.microsoft.com/office/word/2010/wordprocessingShape">
+<w:styles xmlns:w="http://schemas.openxmlformats.org/wordprocessingml/2006/main" xmlns:r="http://schemas.openxmlformats.org/officeDocument/2006/relationships">
   <w:docDefaults>
     <w:rPrDefault>
       <w:rPr>
@@ -832,10 +748,6 @@
   <w:style w:type="paragraph" w:default="1" w:styleId="Normal">
     <w:name w:val="Normal"/>
     <w:qFormat/>
-  </w:style>
-  <w:style w:type="paragraph" w:styleId="Header">
-    <w:name w:val="header"/>
-    <w:basedOn w:val="Normal"/>
   </w:style>
   <w:style w:type="table" w:default="1" w:styleId="TableNormal">
     <w:name w:val="Normal Table"/>

</xml_diff>